<commit_message>
Add M1 GPU pipeline extensions and project deliverables
</commit_message>
<xml_diff>
--- a/docs/traffic_sign_recognition_presenter_guide.docx
+++ b/docs/traffic_sign_recognition_presenter_guide.docx
@@ -2326,7 +2326,7 @@
               <w:rPr>
                 <w:sz w:val="18"/>
               </w:rPr>
-              <w:t>3 epochs</w:t>
+              <w:t>5 epochs · M1 GPU</w:t>
             </w:r>
           </w:p>
         </w:tc>
@@ -2340,7 +2340,7 @@
               <w:rPr>
                 <w:sz w:val="18"/>
               </w:rPr>
-              <w:t>51.75%</w:t>
+              <w:t>56.90%</w:t>
             </w:r>
           </w:p>
         </w:tc>
@@ -2354,7 +2354,7 @@
               <w:rPr>
                 <w:sz w:val="18"/>
               </w:rPr>
-              <w:t>36.44%</w:t>
+              <w:t>56.19%</w:t>
             </w:r>
           </w:p>
         </w:tc>
@@ -2398,7 +2398,7 @@
               <w:rPr>
                 <w:sz w:val="18"/>
               </w:rPr>
-              <w:t>1 epoch</w:t>
+              <w:t>5 epochs · M1 GPU</w:t>
             </w:r>
           </w:p>
         </w:tc>
@@ -2412,7 +2412,7 @@
               <w:rPr>
                 <w:sz w:val="18"/>
               </w:rPr>
-              <w:t>53.09%</w:t>
+              <w:t>62.86%</w:t>
             </w:r>
           </w:p>
         </w:tc>
@@ -2426,7 +2426,7 @@
               <w:rPr>
                 <w:sz w:val="18"/>
               </w:rPr>
-              <w:t>42.24%</w:t>
+              <w:t>55.74%</w:t>
             </w:r>
           </w:p>
         </w:tc>
@@ -2486,12 +2486,12 @@
     </w:p>
     <w:p>
       <w:r>
-        <w:t>The custom CNN achieved 51.75% test accuracy and 36.44% macro F1. MobileNetV2 achieved 53.09% test accuracy and 42.24% macro F1. MobileNetV2 is ahead on both measures in these runs, suggesting that its reusable visual features helped after only one epoch.</w:t>
+        <w:t>The matched M1 GPU run gives the custom CNN 56.90% test accuracy and 56.19% macro F1. MobileNetV2 gives 62.86% test accuracy and 55.74% macro F1. MobileNetV2 leads on overall accuracy, while the custom CNN is slightly stronger on macro F1, so accuracy alone does not tell the whole story.</w:t>
       </w:r>
     </w:p>
     <w:p>
       <w:r>
-        <w:t>Important qualification: these are CPU-feasible demonstration runs with different epoch budgets. They prove that the pipeline works end to end; they are not a claim of the best possible GTSRB score. For a fair performance comparison, train both models for the same number of epochs or the same compute budget on a GPU.</w:t>
+        <w:t>Important qualification: these are five-epoch baseline runs, not a maximum-performance claim. The GPU is Apple M1 Metal, and results can vary slightly with hardware and software versions. A stronger benchmark would tune learning rates, unfreeze more transfer-learning layers, and train longer.</w:t>
       </w:r>
     </w:p>
     <w:p>
@@ -3050,7 +3050,7 @@
     <w:p/>
     <w:p>
       <w:r>
-        <w:t>If time is limited, show the already generated graphs and run the prediction command. Full training on CPU is slow; the Colab notebook is the recommended place for longer GPU experiments.</w:t>
+        <w:t>If time is limited, show the already generated graphs and run the prediction command. Full training is compute-heavy; this project records an Apple M1 Metal GPU run, while the Colab notebook is also suitable for longer GPU experiments.</w:t>
       </w:r>
     </w:p>
     <w:p>
@@ -3210,7 +3210,7 @@
               <w:rPr>
                 <w:sz w:val="18"/>
               </w:rPr>
-              <w:t>Why did MobileNetV2 score higher?</w:t>
+              <w:t>Why did MobileNetV2 score higher in accuracy?</w:t>
             </w:r>
           </w:p>
         </w:tc>
@@ -3224,7 +3224,7 @@
               <w:rPr>
                 <w:sz w:val="18"/>
               </w:rPr>
-              <w:t>It can reuse general visual features; however, the runs have different epoch budgets, so the comparison is preliminary.</w:t>
+              <w:t>It reuses general visual features; the custom CNN is slightly ahead on macro F1, showing that the metric choice matters.</w:t>
             </w:r>
           </w:p>
         </w:tc>
@@ -3254,7 +3254,7 @@
               <w:rPr>
                 <w:sz w:val="18"/>
               </w:rPr>
-              <w:t>No. It classifies a cropped sign. Detection of signs in full scenes is future work.</w:t>
+              <w:t>The main pipeline classifies a cropped sign. An optional YOLO scaffold is included for future full-scene detection.</w:t>
             </w:r>
           </w:p>
         </w:tc>

</xml_diff>

<commit_message>
Refresh project reports with Colab GPU results
</commit_message>
<xml_diff>
--- a/docs/traffic_sign_recognition_presenter_guide.docx
+++ b/docs/traffic_sign_recognition_presenter_guide.docx
@@ -2326,7 +2326,7 @@
               <w:rPr>
                 <w:sz w:val="18"/>
               </w:rPr>
-              <w:t>5 epochs · M1 GPU</w:t>
+              <w:t>Colab GPU · 30/25 epochs</w:t>
             </w:r>
           </w:p>
         </w:tc>
@@ -2340,7 +2340,7 @@
               <w:rPr>
                 <w:sz w:val="18"/>
               </w:rPr>
-              <w:t>56.90%</w:t>
+              <w:t>97.12%</w:t>
             </w:r>
           </w:p>
         </w:tc>
@@ -2354,7 +2354,7 @@
               <w:rPr>
                 <w:sz w:val="18"/>
               </w:rPr>
-              <w:t>56.19%</w:t>
+              <w:t>95.14%</w:t>
             </w:r>
           </w:p>
         </w:tc>
@@ -2384,7 +2384,7 @@
               <w:rPr>
                 <w:sz w:val="18"/>
               </w:rPr>
-              <w:t>96×96</w:t>
+              <w:t>128×128</w:t>
             </w:r>
           </w:p>
         </w:tc>
@@ -2398,7 +2398,7 @@
               <w:rPr>
                 <w:sz w:val="18"/>
               </w:rPr>
-              <w:t>5 epochs · M1 GPU</w:t>
+              <w:t>Colab GPU · 30/25 epochs</w:t>
             </w:r>
           </w:p>
         </w:tc>
@@ -2412,7 +2412,7 @@
               <w:rPr>
                 <w:sz w:val="18"/>
               </w:rPr>
-              <w:t>62.86%</w:t>
+              <w:t>76.18%</w:t>
             </w:r>
           </w:p>
         </w:tc>
@@ -2426,7 +2426,7 @@
               <w:rPr>
                 <w:sz w:val="18"/>
               </w:rPr>
-              <w:t>55.74%</w:t>
+              <w:t>68.23%</w:t>
             </w:r>
           </w:p>
         </w:tc>
@@ -2486,12 +2486,12 @@
     </w:p>
     <w:p>
       <w:r>
-        <w:t>The matched M1 GPU run gives the custom CNN 56.90% test accuracy and 56.19% macro F1. MobileNetV2 gives 62.86% test accuracy and 55.74% macro F1. MobileNetV2 leads on overall accuracy, while the custom CNN is slightly stronger on macro F1, so accuracy alone does not tell the whole story.</w:t>
+        <w:t>The Colab GPU run gives the custom CNN 97.12% test accuracy and 95.14% macro F1. MobileNetV2 gives 76.18% test accuracy and 68.23% macro F1. The custom CNN is ahead because it learns directly from the GTSRB images while the frozen MobileNetV2 transfer-learning setup was not fully adapted to this task.</w:t>
       </w:r>
     </w:p>
     <w:p>
       <w:r>
-        <w:t>Important qualification: these are five-epoch baseline runs, not a maximum-performance claim. The GPU is Apple M1 Metal, and results can vary slightly with hardware and software versions. A stronger benchmark would tune learning rates, unfreeze more transfer-learning layers, and train longer.</w:t>
+        <w:t>Important qualification: these are reproducible 30/25-epoch baselines, not a maximum-performance claim. Results can vary with the Colab GPU, TensorFlow version, random seeds, and whether class weighting or fine-tuning is enabled. The MobileNetV2 configuration should be improved before treating it as the preferred model.</w:t>
       </w:r>
     </w:p>
     <w:p>
@@ -2501,7 +2501,7 @@
       <w:r>
         <w:drawing>
           <wp:inline xmlns:a="http://schemas.openxmlformats.org/drawingml/2006/main" xmlns:pic="http://schemas.openxmlformats.org/drawingml/2006/picture">
-            <wp:extent cx="5394960" cy="1798320"/>
+            <wp:extent cx="5394960" cy="1926771"/>
             <wp:docPr id="6" name="Picture 6"/>
             <wp:cNvGraphicFramePr>
               <a:graphicFrameLocks noChangeAspect="1"/>
@@ -2522,7 +2522,7 @@
                   <pic:spPr>
                     <a:xfrm>
                       <a:off x="0" y="0"/>
-                      <a:ext cx="5394960" cy="1798320"/>
+                      <a:ext cx="5394960" cy="1926771"/>
                     </a:xfrm>
                     <a:prstGeom prst="rect"/>
                   </pic:spPr>
@@ -2552,7 +2552,7 @@
       <w:r>
         <w:drawing>
           <wp:inline xmlns:a="http://schemas.openxmlformats.org/drawingml/2006/main" xmlns:pic="http://schemas.openxmlformats.org/drawingml/2006/picture">
-            <wp:extent cx="5394960" cy="1798320"/>
+            <wp:extent cx="5394960" cy="1926771"/>
             <wp:docPr id="7" name="Picture 7"/>
             <wp:cNvGraphicFramePr>
               <a:graphicFrameLocks noChangeAspect="1"/>
@@ -2573,7 +2573,7 @@
                   <pic:spPr>
                     <a:xfrm>
                       <a:off x="0" y="0"/>
-                      <a:ext cx="5394960" cy="1798320"/>
+                      <a:ext cx="5394960" cy="1926771"/>
                     </a:xfrm>
                     <a:prstGeom prst="rect"/>
                   </pic:spPr>
@@ -2608,7 +2608,7 @@
       <w:r>
         <w:drawing>
           <wp:inline xmlns:a="http://schemas.openxmlformats.org/drawingml/2006/main" xmlns:pic="http://schemas.openxmlformats.org/drawingml/2006/picture">
-            <wp:extent cx="5394960" cy="4495800"/>
+            <wp:extent cx="5394960" cy="4795520"/>
             <wp:docPr id="8" name="Picture 8"/>
             <wp:cNvGraphicFramePr>
               <a:graphicFrameLocks noChangeAspect="1"/>
@@ -2629,7 +2629,7 @@
                   <pic:spPr>
                     <a:xfrm>
                       <a:off x="0" y="0"/>
-                      <a:ext cx="5394960" cy="4495800"/>
+                      <a:ext cx="5394960" cy="4795520"/>
                     </a:xfrm>
                     <a:prstGeom prst="rect"/>
                   </pic:spPr>
@@ -2659,7 +2659,7 @@
       <w:r>
         <w:drawing>
           <wp:inline xmlns:a="http://schemas.openxmlformats.org/drawingml/2006/main" xmlns:pic="http://schemas.openxmlformats.org/drawingml/2006/picture">
-            <wp:extent cx="5394960" cy="4495800"/>
+            <wp:extent cx="5394960" cy="4795520"/>
             <wp:docPr id="9" name="Picture 9"/>
             <wp:cNvGraphicFramePr>
               <a:graphicFrameLocks noChangeAspect="1"/>
@@ -2680,7 +2680,7 @@
                   <pic:spPr>
                     <a:xfrm>
                       <a:off x="0" y="0"/>
-                      <a:ext cx="5394960" cy="4495800"/>
+                      <a:ext cx="5394960" cy="4795520"/>
                     </a:xfrm>
                     <a:prstGeom prst="rect"/>
                   </pic:spPr>
@@ -3050,7 +3050,7 @@
     <w:p/>
     <w:p>
       <w:r>
-        <w:t>If time is limited, show the already generated graphs and run the prediction command. Full training is compute-heavy; this project records an Apple M1 Metal GPU run, while the Colab notebook is also suitable for longer GPU experiments.</w:t>
+        <w:t>If time is limited, show the already generated graphs and run the prediction command. Full training is compute-heavy; the recorded benchmark in this report was produced on a Colab GPU, while the local M1 Metal setup is also supported for shorter experiments.</w:t>
       </w:r>
     </w:p>
     <w:p>

</xml_diff>

<commit_message>
Add verified literature survey to project documents
</commit_message>
<xml_diff>
--- a/docs/traffic_sign_recognition_presenter_guide.docx
+++ b/docs/traffic_sign_recognition_presenter_guide.docx
@@ -1390,7 +1390,7 @@
               <w:rPr>
                 <w:sz w:val="18"/>
               </w:rPr>
-              <w:t>Convert images to 64×64 or 96×96</w:t>
+              <w:t>Convert images to 64×64 or 128×128</w:t>
             </w:r>
           </w:p>
         </w:tc>
@@ -2182,7 +2182,373 @@
         <w:pStyle w:val="Heading1"/>
       </w:pPr>
       <w:r>
-        <w:t>11. Actual Results</w:t>
+        <w:t>11. Literature Survey and Design Evidence</w:t>
+      </w:r>
+    </w:p>
+    <w:p>
+      <w:r>
+        <w:t>A literature survey answers two questions: what has already been established by researchers, and how did that evidence influence our implementation? The sources below were checked against the original papers or official documentation. They support design choices; they do not automatically prove that our particular model is optimal.</w:t>
+      </w:r>
+    </w:p>
+    <w:tbl>
+      <w:tblPr>
+        <w:tblStyle w:val="TableGrid"/>
+        <w:tblW w:type="auto" w:w="0"/>
+        <w:jc w:val="center"/>
+        <w:tblLayout w:type="autofit"/>
+        <w:tblLook w:firstColumn="1" w:firstRow="1" w:lastColumn="0" w:lastRow="0" w:noHBand="0" w:noVBand="1" w:val="04A0"/>
+      </w:tblPr>
+      <w:tblGrid>
+        <w:gridCol w:w="3312"/>
+        <w:gridCol w:w="3312"/>
+        <w:gridCol w:w="3312"/>
+      </w:tblGrid>
+      <w:tr>
+        <w:tc>
+          <w:tcPr>
+            <w:tcW w:type="dxa" w:w="3312"/>
+            <w:shd w:fill="173B57"/>
+            <w:vAlign w:val="center"/>
+          </w:tcPr>
+          <w:p>
+            <w:r>
+              <w:rPr>
+                <w:b/>
+                <w:color w:val="FFFFFF"/>
+                <w:sz w:val="18"/>
+              </w:rPr>
+              <w:t>Source</w:t>
+            </w:r>
+          </w:p>
+        </w:tc>
+        <w:tc>
+          <w:tcPr>
+            <w:tcW w:type="dxa" w:w="3312"/>
+            <w:shd w:fill="173B57"/>
+            <w:vAlign w:val="center"/>
+          </w:tcPr>
+          <w:p>
+            <w:r>
+              <w:rPr>
+                <w:b/>
+                <w:color w:val="FFFFFF"/>
+                <w:sz w:val="18"/>
+              </w:rPr>
+              <w:t>Main idea</w:t>
+            </w:r>
+          </w:p>
+        </w:tc>
+        <w:tc>
+          <w:tcPr>
+            <w:tcW w:type="dxa" w:w="3312"/>
+            <w:shd w:fill="173B57"/>
+            <w:vAlign w:val="center"/>
+          </w:tcPr>
+          <w:p>
+            <w:r>
+              <w:rPr>
+                <w:b/>
+                <w:color w:val="FFFFFF"/>
+                <w:sz w:val="18"/>
+              </w:rPr>
+              <w:t>Used here</w:t>
+            </w:r>
+          </w:p>
+        </w:tc>
+      </w:tr>
+      <w:tr>
+        <w:tc>
+          <w:tcPr>
+            <w:tcW w:type="dxa" w:w="3312"/>
+            <w:vAlign w:val="center"/>
+          </w:tcPr>
+          <w:p>
+            <w:r>
+              <w:rPr>
+                <w:sz w:val="18"/>
+              </w:rPr>
+              <w:t>Stallkamp et al. 2011 — GTSRB</w:t>
+            </w:r>
+          </w:p>
+        </w:tc>
+        <w:tc>
+          <w:tcPr>
+            <w:tcW w:type="dxa" w:w="3312"/>
+            <w:vAlign w:val="center"/>
+          </w:tcPr>
+          <w:p>
+            <w:r>
+              <w:rPr>
+                <w:sz w:val="18"/>
+              </w:rPr>
+              <w:t>Defines a real-world multi-class traffic-sign benchmark with visual variation.</w:t>
+            </w:r>
+          </w:p>
+        </w:tc>
+        <w:tc>
+          <w:tcPr>
+            <w:tcW w:type="dxa" w:w="3312"/>
+            <w:vAlign w:val="center"/>
+          </w:tcPr>
+          <w:p>
+            <w:r>
+              <w:rPr>
+                <w:sz w:val="18"/>
+              </w:rPr>
+              <w:t>Dataset choice, 43-class scope, official test evaluation.</w:t>
+            </w:r>
+          </w:p>
+        </w:tc>
+      </w:tr>
+      <w:tr>
+        <w:tc>
+          <w:tcPr>
+            <w:tcW w:type="dxa" w:w="3312"/>
+            <w:vAlign w:val="center"/>
+          </w:tcPr>
+          <w:p>
+            <w:r>
+              <w:rPr>
+                <w:sz w:val="18"/>
+              </w:rPr>
+              <w:t>Sandler et al. 2018 — MobileNetV2</w:t>
+            </w:r>
+          </w:p>
+        </w:tc>
+        <w:tc>
+          <w:tcPr>
+            <w:tcW w:type="dxa" w:w="3312"/>
+            <w:vAlign w:val="center"/>
+          </w:tcPr>
+          <w:p>
+            <w:r>
+              <w:rPr>
+                <w:sz w:val="18"/>
+              </w:rPr>
+              <w:t>Efficient inverted residual and depthwise-convolution architecture.</w:t>
+            </w:r>
+          </w:p>
+        </w:tc>
+        <w:tc>
+          <w:tcPr>
+            <w:tcW w:type="dxa" w:w="3312"/>
+            <w:vAlign w:val="center"/>
+          </w:tcPr>
+          <w:p>
+            <w:r>
+              <w:rPr>
+                <w:sz w:val="18"/>
+              </w:rPr>
+              <w:t>Lightweight transfer-learning comparison model.</w:t>
+            </w:r>
+          </w:p>
+        </w:tc>
+      </w:tr>
+      <w:tr>
+        <w:tc>
+          <w:tcPr>
+            <w:tcW w:type="dxa" w:w="3312"/>
+            <w:vAlign w:val="center"/>
+          </w:tcPr>
+          <w:p>
+            <w:r>
+              <w:rPr>
+                <w:sz w:val="18"/>
+              </w:rPr>
+              <w:t>Kingma and Ba 2015 — Adam</w:t>
+            </w:r>
+          </w:p>
+        </w:tc>
+        <w:tc>
+          <w:tcPr>
+            <w:tcW w:type="dxa" w:w="3312"/>
+            <w:vAlign w:val="center"/>
+          </w:tcPr>
+          <w:p>
+            <w:r>
+              <w:rPr>
+                <w:sz w:val="18"/>
+              </w:rPr>
+              <w:t>Adaptive optimizer based on gradient moment estimates.</w:t>
+            </w:r>
+          </w:p>
+        </w:tc>
+        <w:tc>
+          <w:tcPr>
+            <w:tcW w:type="dxa" w:w="3312"/>
+            <w:vAlign w:val="center"/>
+          </w:tcPr>
+          <w:p>
+            <w:r>
+              <w:rPr>
+                <w:sz w:val="18"/>
+              </w:rPr>
+              <w:t>Optimizer used in the training protocol.</w:t>
+            </w:r>
+          </w:p>
+        </w:tc>
+      </w:tr>
+      <w:tr>
+        <w:tc>
+          <w:tcPr>
+            <w:tcW w:type="dxa" w:w="3312"/>
+            <w:vAlign w:val="center"/>
+          </w:tcPr>
+          <w:p>
+            <w:r>
+              <w:rPr>
+                <w:sz w:val="18"/>
+              </w:rPr>
+              <w:t>Selvaraju et al. 2017 — Grad-CAM</w:t>
+            </w:r>
+          </w:p>
+        </w:tc>
+        <w:tc>
+          <w:tcPr>
+            <w:tcW w:type="dxa" w:w="3312"/>
+            <w:vAlign w:val="center"/>
+          </w:tcPr>
+          <w:p>
+            <w:r>
+              <w:rPr>
+                <w:sz w:val="18"/>
+              </w:rPr>
+              <w:t>Gradient-based class-discriminative localization map.</w:t>
+            </w:r>
+          </w:p>
+        </w:tc>
+        <w:tc>
+          <w:tcPr>
+            <w:tcW w:type="dxa" w:w="3312"/>
+            <w:vAlign w:val="center"/>
+          </w:tcPr>
+          <w:p>
+            <w:r>
+              <w:rPr>
+                <w:sz w:val="18"/>
+              </w:rPr>
+              <w:t>Qualitative explanation and error inspection.</w:t>
+            </w:r>
+          </w:p>
+        </w:tc>
+      </w:tr>
+      <w:tr>
+        <w:tc>
+          <w:tcPr>
+            <w:tcW w:type="dxa" w:w="3312"/>
+            <w:vAlign w:val="center"/>
+          </w:tcPr>
+          <w:p>
+            <w:r>
+              <w:rPr>
+                <w:sz w:val="18"/>
+              </w:rPr>
+              <w:t>scikit-learn — GroupShuffleSplit</w:t>
+            </w:r>
+          </w:p>
+        </w:tc>
+        <w:tc>
+          <w:tcPr>
+            <w:tcW w:type="dxa" w:w="3312"/>
+            <w:vAlign w:val="center"/>
+          </w:tcPr>
+          <w:p>
+            <w:r>
+              <w:rPr>
+                <w:sz w:val="18"/>
+              </w:rPr>
+              <w:t>Splits samples by group rather than independently.</w:t>
+            </w:r>
+          </w:p>
+        </w:tc>
+        <w:tc>
+          <w:tcPr>
+            <w:tcW w:type="dxa" w:w="3312"/>
+            <w:vAlign w:val="center"/>
+          </w:tcPr>
+          <w:p>
+            <w:r>
+              <w:rPr>
+                <w:sz w:val="18"/>
+              </w:rPr>
+              <w:t>Keeps related sequences together during validation.</w:t>
+            </w:r>
+          </w:p>
+        </w:tc>
+      </w:tr>
+      <w:tr>
+        <w:tc>
+          <w:tcPr>
+            <w:tcW w:type="dxa" w:w="3312"/>
+            <w:vAlign w:val="center"/>
+          </w:tcPr>
+          <w:p>
+            <w:r>
+              <w:rPr>
+                <w:sz w:val="18"/>
+              </w:rPr>
+              <w:t>TensorFlow and Keras documentation</w:t>
+            </w:r>
+          </w:p>
+        </w:tc>
+        <w:tc>
+          <w:tcPr>
+            <w:tcW w:type="dxa" w:w="3312"/>
+            <w:vAlign w:val="center"/>
+          </w:tcPr>
+          <w:p>
+            <w:r>
+              <w:rPr>
+                <w:sz w:val="18"/>
+              </w:rPr>
+              <w:t>Streaming/prefetched input pipelines, augmentation, and callbacks.</w:t>
+            </w:r>
+          </w:p>
+        </w:tc>
+        <w:tc>
+          <w:tcPr>
+            <w:tcW w:type="dxa" w:w="3312"/>
+            <w:vAlign w:val="center"/>
+          </w:tcPr>
+          <w:p>
+            <w:r>
+              <w:rPr>
+                <w:sz w:val="18"/>
+              </w:rPr>
+              <w:t>Efficient loading, training-only transformations, checkpointing, and stopping rules.</w:t>
+            </w:r>
+          </w:p>
+        </w:tc>
+      </w:tr>
+    </w:tbl>
+    <w:p/>
+    <w:p>
+      <w:r>
+        <w:t>How to explain the connection: the GTSRB paper motivates the dataset and the need to handle variation; MobileNetV2 motivates a compact comparison architecture; Adam and Keras callbacks define a practical optimization protocol; GroupShuffleSplit protects validation from sequence-related leakage; tf.data keeps the full dataset manageable; and Grad-CAM gives a visual diagnostic. The optional YOLO code is not supported by the GTSRB classification labels, so it is documented as a future detector extension rather than reported as a trained detector.</w:t>
+      </w:r>
+    </w:p>
+    <w:p>
+      <w:r>
+        <w:rPr>
+          <w:b/>
+        </w:rPr>
+        <w:t>Presenter wording:</w:t>
+      </w:r>
+      <w:r>
+        <w:t xml:space="preserve"> “Our literature survey is not a list of unrelated papers. Each reference has a traceable role: benchmark definition, architecture choice, optimizer, leakage control, data pipeline, training control, or interpretability. That traceability makes the implementation easier to justify and reproduce.”</w:t>
+      </w:r>
+    </w:p>
+    <w:p>
+      <w:r>
+        <w:t>Verified reading list: GTSRB primary paper — https://www.ini.rub.de/upload/file/1470692848_f03494010c16c36bab9e/StallkampEtAl_GTSRB_IJCNN2011.pdf; MobileNetV2 — https://arxiv.org/abs/1801.04381; Adam — https://arxiv.org/abs/1412.6980; Grad-CAM — https://openaccess.thecvf.com/content_ICCV_2017/papers/Selvaraju_Grad-CAM_Visual_Explanations_ICCV_2017_paper.pdf; GroupShuffleSplit — https://scikit-learn.org/1.5/modules/generated/sklearn.model_selection.GroupShuffleSplit.html; TensorFlow/Keras — https://www.tensorflow.org/guide/data_performance and https://keras.io/api/callbacks/.</w:t>
+      </w:r>
+    </w:p>
+    <w:p>
+      <w:pPr>
+        <w:pStyle w:val="Heading1"/>
+      </w:pPr>
+      <w:r>
+        <w:t>12. Actual Results</w:t>
       </w:r>
     </w:p>
     <w:tbl>
@@ -2708,7 +3074,7 @@
         <w:pStyle w:val="Heading1"/>
       </w:pPr>
       <w:r>
-        <w:t>12. Live Demonstration Script</w:t>
+        <w:t>13. Live Demonstration Script</w:t>
       </w:r>
     </w:p>
     <w:p>
@@ -3058,7 +3424,7 @@
         <w:pStyle w:val="Heading1"/>
       </w:pPr>
       <w:r>
-        <w:t>13. Questions You May Be Asked</w:t>
+        <w:t>14. Questions You May Be Asked</w:t>
       </w:r>
     </w:p>
     <w:tbl>
@@ -3210,7 +3576,7 @@
               <w:rPr>
                 <w:sz w:val="18"/>
               </w:rPr>
-              <w:t>Why did MobileNetV2 score higher in accuracy?</w:t>
+              <w:t>Why did the custom CNN score higher?</w:t>
             </w:r>
           </w:p>
         </w:tc>
@@ -3224,7 +3590,7 @@
               <w:rPr>
                 <w:sz w:val="18"/>
               </w:rPr>
-              <w:t>It reuses general visual features; the custom CNN is slightly ahead on macro F1, showing that the metric choice matters.</w:t>
+              <w:t>The custom CNN learned directly from GTSRB. MobileNetV2 used a frozen transfer-learning backbone, so it needs fine-tuning for this task.</w:t>
             </w:r>
           </w:p>
         </w:tc>
@@ -3296,7 +3662,7 @@
         <w:pStyle w:val="Heading1"/>
       </w:pPr>
       <w:r>
-        <w:t>14. Glossary</w:t>
+        <w:t>15. Glossary</w:t>
       </w:r>
     </w:p>
     <w:tbl>
@@ -3654,7 +4020,7 @@
         <w:pStyle w:val="Heading1"/>
       </w:pPr>
       <w:r>
-        <w:t>15. Final Closing Statement</w:t>
+        <w:t>16. Final Closing Statement</w:t>
       </w:r>
     </w:p>
     <w:p>

</xml_diff>